<commit_message>
Fix dotenv loading for values with spaces
</commit_message>
<xml_diff>
--- a/docs/docx/ubuntu-full-setup-guide.docx
+++ b/docs/docx/ubuntu-full-setup-guide.docx
@@ -908,7 +908,7 @@
         <w:shd w:fill="EEF4F8"/>
       </w:pPr>
       <w:r>
-        <w:t>DEFAULT_COUNTRY=United States</w:t>
+        <w:t>DEFAULT_COUNTRY="United States"</w:t>
       </w:r>
     </w:p>
     <w:p>
@@ -918,6 +918,33 @@
       </w:pPr>
       <w:r>
         <w:t>DEFAULT_TIMEZONE=Etc/UTC</w:t>
+      </w:r>
+    </w:p>
+    <w:p>
+      <w:r>
+        <w:t xml:space="preserve">Values with spaces may be quoted. The maintenance scripts use a safe dotenv loader, so </w:t>
+      </w:r>
+      <w:r>
+        <w:rPr>
+          <w:rFonts w:ascii="Consolas" w:hAnsi="Consolas"/>
+          <w:color w:val="144870"/>
+          <w:sz w:val="19"/>
+        </w:rPr>
+        <w:t>DEFAULT_COUNTRY=United States</w:t>
+      </w:r>
+      <w:r>
+        <w:t xml:space="preserve"> and </w:t>
+      </w:r>
+      <w:r>
+        <w:rPr>
+          <w:rFonts w:ascii="Consolas" w:hAnsi="Consolas"/>
+          <w:color w:val="144870"/>
+          <w:sz w:val="19"/>
+        </w:rPr>
+        <w:t>DEFAULT_COUNTRY="United States"</w:t>
+      </w:r>
+      <w:r>
+        <w:t xml:space="preserve"> both work. Quoting is still recommended for readability.</w:t>
       </w:r>
     </w:p>
     <w:p>
@@ -4227,7 +4254,18 @@
         <w:t>$SITE_NAME</w:t>
       </w:r>
       <w:r>
-        <w:t xml:space="preserve"> is not loaded in your shell:</w:t>
+        <w:t xml:space="preserve"> is not loaded in your shell, pass it explicitly. Do not run </w:t>
+      </w:r>
+      <w:r>
+        <w:rPr>
+          <w:rFonts w:ascii="Consolas" w:hAnsi="Consolas"/>
+          <w:color w:val="144870"/>
+          <w:sz w:val="19"/>
+        </w:rPr>
+        <w:t>source .env</w:t>
+      </w:r>
+      <w:r>
+        <w:t xml:space="preserve"> on files that contain unquoted values with spaces.</w:t>
       </w:r>
     </w:p>
     <w:p>
@@ -4245,16 +4283,7 @@
         <w:shd w:fill="EEF4F8"/>
       </w:pPr>
       <w:r>
-        <w:t>source .env</w:t>
-      </w:r>
-    </w:p>
-    <w:p>
-      <w:pPr>
-        <w:pStyle w:val="EMSCodeBlock"/>
-        <w:shd w:fill="EEF4F8"/>
-      </w:pPr>
-      <w:r>
-        <w:t>docker compose exec backend bench --site "$SITE_NAME" clear-cache</w:t>
+        <w:t>docker compose exec backend bench --site your-site.example.org clear-cache</w:t>
       </w:r>
     </w:p>
     <w:p>

</xml_diff>